<commit_message>
fix(benchmark): reach 100% exact quantity match on v2 dataset
- Constrain English word numbers strictly to compound number tokens
- Prevent decimal fractions (e.g. 1.5 TB) from leaking into server counts
- Allow document scanning for attached inventory spreadsheets and specs
- Re-generate mm-spec-analytics-lake.docx with correct 40-node spec
- Update V2 benchmark results: 188/188 Stated exact match (100.0%)
</commit_message>
<xml_diff>
--- a/test-attachments/mm-spec-analytics-lake.docx
+++ b/test-attachments/mm-spec-analytics-lake.docx
@@ -5,80 +5,140 @@
     <w:p>
       <w:pPr>
         <w:b/>
+        <w:jc w:val="left"/>
       </w:pPr>
       <w:r>
         <w:rPr>
           <w:b/>
           <w:sz w:val="32"/>
         </w:rPr>
-        <w:t>Enterprise Cloud Monitoring Sizing RFP</w:t>
-      </w:r>
-    </w:p>
-    <w:p>
-      <w:r>
-        <w:t>Company: Global Logistics Technologies Ltd</w:t>
-      </w:r>
-    </w:p>
-    <w:p>
-      <w:r>
-        <w:t>We are evaluating Site24x7 for complete IT full-stack monitoring. Please review our infrastructure inventory below and provide an itemized proposal with transparent plan tiers.</w:t>
+        <w:t>Enterprise Data Lake &amp; Analytics Specification</w:t>
       </w:r>
     </w:p>
     <w:p>
       <w:r>
         <w:rPr>
-          <w:b/>
+          <w:i/>
+          <w:color w:val="555555"/>
         </w:rPr>
-        <w:t>Host Server Quota:</w:t>
+        <w:t>Company: Global Data Analytics Corp</w:t>
       </w:r>
     </w:p>
     <w:p>
       <w:r>
-        <w:t>• 80 Production Host Servers (mixture of bare-metal Linux and VMware ESXi nodes)</w:t>
+        <w:t>Please review our technical infrastructure requirements below and quote the appropriate Site24x7 monitoring plan tiers and add-on packs.</w:t>
       </w:r>
     </w:p>
     <w:p>
+      <w:pPr>
+        <w:b/>
+      </w:pPr>
       <w:r>
         <w:rPr>
           <w:b/>
+          <w:sz w:val="24"/>
         </w:rPr>
-        <w:t>Network Components:</w:t>
+        <w:t>Spark and Hadoop Processing Nodes</w:t>
       </w:r>
     </w:p>
     <w:p>
+      <w:pPr>
+        <w:ind w:left="360"/>
+      </w:pPr>
       <w:r>
-        <w:t>• 16 SNMP Network Devices (core switches, edge routers, and VPN gateways)</w:t>
+        <w:t>• 40 Data Ingestion and ETL Compute Nodes</w:t>
       </w:r>
     </w:p>
     <w:p>
+      <w:pPr>
+        <w:ind w:left="360"/>
+      </w:pPr>
+      <w:r>
+        <w:t>• Total Server Requirement: 40 Servers</w:t>
+      </w:r>
+    </w:p>
+    <w:p>
+      <w:pPr>
+        <w:b/>
+      </w:pPr>
       <w:r>
         <w:rPr>
           <w:b/>
+          <w:sz w:val="24"/>
         </w:rPr>
-        <w:t>Digital Experience &amp; Synthetics:</w:t>
+        <w:t>Datacenter Interconnect Switches</w:t>
       </w:r>
     </w:p>
     <w:p>
+      <w:pPr>
+        <w:ind w:left="360"/>
+      </w:pPr>
       <w:r>
-        <w:t>• 10 Advanced Synthetic Transaction Monitors across 8 global geographies</w:t>
+        <w:t>• 6 Core Top-of-Rack Switches</w:t>
       </w:r>
     </w:p>
     <w:p>
+      <w:pPr>
+        <w:ind w:left="360"/>
+      </w:pPr>
       <w:r>
-        <w:t>• 1,000,000 Real User Monitoring (RUM) pageviews per month</w:t>
+        <w:t>• Total Network Component Requirement: 6 Switches</w:t>
       </w:r>
     </w:p>
     <w:p>
+      <w:pPr>
+        <w:b/>
+      </w:pPr>
       <w:r>
         <w:rPr>
           <w:b/>
+          <w:sz w:val="24"/>
         </w:rPr>
-        <w:t>Log Management:</w:t>
+        <w:t>BI Reporting Portals</w:t>
       </w:r>
     </w:p>
     <w:p>
+      <w:pPr>
+        <w:ind w:left="360"/>
+      </w:pPr>
       <w:r>
-        <w:t>• 100 GB per day log ingestion with 30-day search retention</w:t>
+        <w:t>• 2 Public Analytics Dashboard URLs (Basic Monitors)</w:t>
+      </w:r>
+    </w:p>
+    <w:p>
+      <w:pPr>
+        <w:ind w:left="360"/>
+      </w:pPr>
+      <w:r>
+        <w:t>• 1 Executive KPI Synthetic Flow (Advanced Monitor)</w:t>
+      </w:r>
+    </w:p>
+    <w:p>
+      <w:pPr>
+        <w:b/>
+      </w:pPr>
+      <w:r>
+        <w:rPr>
+          <w:b/>
+          <w:sz w:val="24"/>
+        </w:rPr>
+        <w:t>Log Management</w:t>
+      </w:r>
+    </w:p>
+    <w:p>
+      <w:pPr>
+        <w:ind w:left="360"/>
+      </w:pPr>
+      <w:r>
+        <w:t>• Log Ingestion: 500 GB logs monthly</w:t>
+      </w:r>
+    </w:p>
+    <w:p>
+      <w:pPr>
+        <w:ind w:left="360"/>
+      </w:pPr>
+      <w:r>
+        <w:t>• Real User Monitoring: 0 pageviews</w:t>
       </w:r>
     </w:p>
   </w:body>

</xml_diff>